<commit_message>
Update internship summary docx with natural tone text
</commit_message>
<xml_diff>
--- a/assets/实习总结_chisa.official.docx
+++ b/assets/实习总结_chisa.official.docx
@@ -393,7 +393,7 @@
           <w:sz w:val="24"/>
           <w:szCs w:val="24"/>
         </w:rPr>
-        <w:t xml:space="preserve">本次暑期实习于广东创科安全科技有限公司进行，担任人工智能应用助理一职。实习期间，主要围绕AI编程、AIGC（AI图像生成）、企业资产收集及网络安全学习四大方向开展工作。在AI编程方面，独立开发了一套高校学生管理系统和一个个人主页静态网站；在AIGC方面，围绕透明亚克力键盘电商图和桌宠动图两个项目开展了AI图像生成的探索与实践，其中键盘电商图项目因难度较高仅完成部分白底样例图，桌宠动图项目进行了多种动图实现方案的尝试并积累了角色提示词工程成果；同时参与了企业实地资产收集工作，并深入学习了网络安全实践知识。通过本次实习，将课堂所学的软件工程理论与AI技术应用相结合，显著提升了全栈开发能力和AI工程化探索能力。</w:t>
+        <w:t xml:space="preserve">今年暑假，我进入广东创科安全科技有限公司实习，岗位是人工智能应用助理。整个实习过程围绕四条主线展开：AI编程、AIGC图像生成、企业资产收集，还有网络安全方面的学习。编程这条线上，我一个人扛下来两件事——一套高校学生管理系统和一个个人主页网站。AIGC这边做了两个项目，一个是透明亚克力键盘的电商白底图，另一个是桌宠角色动图。说起来，这两个项目的推进过程并不像预想中那样顺利。键盘图因为透明材质的还原难度超出了预期，到实习结束也只完成了几张白底样例；桌宠动图尝试了好几种技术路径，但出来的效果始终不达标，最后真正能拿出来的成果是一套角色特征反推的提示词工程方法。此外，我还跟着同事去松山湖做了一次企业资产实地收集，也花时间研究了网安团队在工作中遇到的真实漏洞案例。这段实习让我把课堂上的东西真正用到了工程场景里，全栈开发和AI应用两方面的动手能力都有了明显的进步。</w:t>
       </w:r>
     </w:p>
     <w:p>
@@ -461,7 +461,7 @@
           <w:sz w:val="24"/>
           <w:szCs w:val="24"/>
         </w:rPr>
-        <w:t xml:space="preserve">该系统是一套面向高校学生管理与教务场景的全栈Web应用，包含学生端前台、后台管理端和公共支撑模块三大部分，覆盖学生档案管理、教务排课、学籍异动、选课退课、宿舍管理、考勤预警、通知公告、反馈报修等核心业务。</w:t>
+        <w:t xml:space="preserve">这是一个面向高校学生管理场景的全栈Web应用。我把它拆成三块来做：学生用的前台、管理员用的后台，还有两端共用的公共支撑模块。业务上覆盖了学生档案、教务排课、选课退课、宿舍管理、考勤预警、通知公告这些日常功能。</w:t>
       </w:r>
     </w:p>
     <w:p>
@@ -484,7 +484,7 @@
           <w:sz w:val="24"/>
           <w:szCs w:val="24"/>
         </w:rPr>
-        <w:t xml:space="preserve">Vue 3 + TypeScript + Vite + Pinia + Element Plus（前端）；Node.js + Express + Prisma + MySQL + Socket.IO（后端）。</w:t>
+        <w:t xml:space="preserve">前端选了Vue 3 + TypeScript + Vite + Pinia + Element Plus，后端用Node.js + Express + Prisma + MySQL，实时通信靠Socket.IO。</w:t>
       </w:r>
     </w:p>
     <w:p>
@@ -524,109 +524,109 @@
           <w:sz w:val="24"/>
           <w:szCs w:val="24"/>
         </w:rPr>
-        <w:t xml:space="preserve">数据库设计：基于Prisma ORM设计30余个数据模型、20余个枚举类型，覆盖学生、课程、宿舍、奖助、违纪等全业务领域。</w:t>
-      </w:r>
-    </w:p>
-    <w:p>
-      <w:pPr>
-        <w:pStyle w:val="ListParagraph"/>
-        <w:numPr>
-          <w:ilvl w:val="0"/>
-          <w:numId w:val="2"/>
-        </w:numPr>
-        <w:spacing w:after="80" w:line="340"/>
-      </w:pPr>
-      <w:r>
-        <w:rPr>
-          <w:sz w:val="24"/>
-          <w:szCs w:val="24"/>
-        </w:rPr>
-        <w:t xml:space="preserve">后端API：开发75余个RESTful接口，采用分层架构（路由→控制器→服务→公共支撑），集成JWT双Token认证、RBAC权限控制、Zod参数校验、Winston日志、定时备份等企业级功能。</w:t>
-      </w:r>
-    </w:p>
-    <w:p>
-      <w:pPr>
-        <w:pStyle w:val="ListParagraph"/>
-        <w:numPr>
-          <w:ilvl w:val="0"/>
-          <w:numId w:val="2"/>
-        </w:numPr>
-        <w:spacing w:after="80" w:line="340"/>
-      </w:pPr>
-      <w:r>
-        <w:rPr>
-          <w:sz w:val="24"/>
-          <w:szCs w:val="24"/>
-        </w:rPr>
-        <w:t xml:space="preserve">学生端前台：实现22个视图组件、20条路由，包含个人信息、课表成绩、选课退课、请假申请、宿舍管理等学生自助功能。</w:t>
-      </w:r>
-    </w:p>
-    <w:p>
-      <w:pPr>
-        <w:pStyle w:val="ListParagraph"/>
-        <w:numPr>
-          <w:ilvl w:val="0"/>
-          <w:numId w:val="2"/>
-        </w:numPr>
-        <w:spacing w:after="80" w:line="340"/>
-      </w:pPr>
-      <w:r>
-        <w:rPr>
-          <w:sz w:val="24"/>
-          <w:szCs w:val="24"/>
-        </w:rPr>
-        <w:t xml:space="preserve">后台管理端：实现66个视图组件，采用动态路由注册机制，包含学生档案管理、教务排课、学工审批、宿舍管理、报表统计等管理功能。</w:t>
-      </w:r>
-    </w:p>
-    <w:p>
-      <w:pPr>
-        <w:pStyle w:val="ListParagraph"/>
-        <w:numPr>
-          <w:ilvl w:val="0"/>
-          <w:numId w:val="2"/>
-        </w:numPr>
-        <w:spacing w:after="80" w:line="340"/>
-      </w:pPr>
-      <w:r>
-        <w:rPr>
-          <w:sz w:val="24"/>
-          <w:szCs w:val="24"/>
-        </w:rPr>
-        <w:t xml:space="preserve">公共支撑模块：开发12个子模块（认证、文件存储、消息推送、导入导出、系统配置、数据库备份、日志等），两端复用。</w:t>
-      </w:r>
-    </w:p>
-    <w:p>
-      <w:pPr>
-        <w:pStyle w:val="ListParagraph"/>
-        <w:numPr>
-          <w:ilvl w:val="0"/>
-          <w:numId w:val="2"/>
-        </w:numPr>
-        <w:spacing w:after="80" w:line="340"/>
-      </w:pPr>
-      <w:r>
-        <w:rPr>
-          <w:sz w:val="24"/>
-          <w:szCs w:val="24"/>
-        </w:rPr>
-        <w:t xml:space="preserve">实时通信：基于Socket.IO实现WebSocket实时通信，支持站内消息推送和审批通知。</w:t>
-      </w:r>
-    </w:p>
-    <w:p>
-      <w:pPr>
-        <w:pStyle w:val="ListParagraph"/>
-        <w:numPr>
-          <w:ilvl w:val="0"/>
-          <w:numId w:val="2"/>
-        </w:numPr>
-        <w:spacing w:after="80" w:line="340"/>
-      </w:pPr>
-      <w:r>
-        <w:rPr>
-          <w:sz w:val="24"/>
-          <w:szCs w:val="24"/>
-        </w:rPr>
-        <w:t xml:space="preserve">文件系统：实现本地/OSS双模式文件存储抽象层，支持Excel导入导出和PDF生成。</w:t>
+        <w:t xml:space="preserve">数据库这块，我基于Prisma ORM设计了30多个数据模型和20多个枚举类型，把学生、课程、宿舍、奖助、违纪这些业务领域的表结构全部定义清楚。</w:t>
+      </w:r>
+    </w:p>
+    <w:p>
+      <w:pPr>
+        <w:pStyle w:val="ListParagraph"/>
+        <w:numPr>
+          <w:ilvl w:val="0"/>
+          <w:numId w:val="2"/>
+        </w:numPr>
+        <w:spacing w:after="80" w:line="340"/>
+      </w:pPr>
+      <w:r>
+        <w:rPr>
+          <w:sz w:val="24"/>
+          <w:szCs w:val="24"/>
+        </w:rPr>
+        <w:t xml:space="preserve">后端一共写了75个RESTful接口，采用分层架构（路由到控制器到服务到公共支撑）。JWT双Token认证、RBAC权限控制、Zod参数校验、Winston日志、定时备份这些企业级功能也都集成进去了。</w:t>
+      </w:r>
+    </w:p>
+    <w:p>
+      <w:pPr>
+        <w:pStyle w:val="ListParagraph"/>
+        <w:numPr>
+          <w:ilvl w:val="0"/>
+          <w:numId w:val="2"/>
+        </w:numPr>
+        <w:spacing w:after="80" w:line="340"/>
+      </w:pPr>
+      <w:r>
+        <w:rPr>
+          <w:sz w:val="24"/>
+          <w:szCs w:val="24"/>
+        </w:rPr>
+        <w:t xml:space="preserve">学生端前台实现了22个视图组件和20条路由，个人信息、课表成绩、选课退课、请假申请、宿舍管理这些自助功能都能用。</w:t>
+      </w:r>
+    </w:p>
+    <w:p>
+      <w:pPr>
+        <w:pStyle w:val="ListParagraph"/>
+        <w:numPr>
+          <w:ilvl w:val="0"/>
+          <w:numId w:val="2"/>
+        </w:numPr>
+        <w:spacing w:after="80" w:line="340"/>
+      </w:pPr>
+      <w:r>
+        <w:rPr>
+          <w:sz w:val="24"/>
+          <w:szCs w:val="24"/>
+        </w:rPr>
+        <w:t xml:space="preserve">后台管理端规模更大一些，66个视图组件，走动态路由注册机制。学生档案、教务排课、学工审批、宿舍管理、报表统计这些管理功能都放在这一端。</w:t>
+      </w:r>
+    </w:p>
+    <w:p>
+      <w:pPr>
+        <w:pStyle w:val="ListParagraph"/>
+        <w:numPr>
+          <w:ilvl w:val="0"/>
+          <w:numId w:val="2"/>
+        </w:numPr>
+        <w:spacing w:after="80" w:line="340"/>
+      </w:pPr>
+      <w:r>
+        <w:rPr>
+          <w:sz w:val="24"/>
+          <w:szCs w:val="24"/>
+        </w:rPr>
+        <w:t xml:space="preserve">公共支撑模块我拆成12个子模块——认证、文件存储、消息推送、导入导出、系统配置、数据库备份、日志等等，两端复用，避免重复造轮子。</w:t>
+      </w:r>
+    </w:p>
+    <w:p>
+      <w:pPr>
+        <w:pStyle w:val="ListParagraph"/>
+        <w:numPr>
+          <w:ilvl w:val="0"/>
+          <w:numId w:val="2"/>
+        </w:numPr>
+        <w:spacing w:after="80" w:line="340"/>
+      </w:pPr>
+      <w:r>
+        <w:rPr>
+          <w:sz w:val="24"/>
+          <w:szCs w:val="24"/>
+        </w:rPr>
+        <w:t xml:space="preserve">实时通信这块，用Socket.IO搭了WebSocket通道，站内消息推送和审批通知都能即时送达。</w:t>
+      </w:r>
+    </w:p>
+    <w:p>
+      <w:pPr>
+        <w:pStyle w:val="ListParagraph"/>
+        <w:numPr>
+          <w:ilvl w:val="0"/>
+          <w:numId w:val="2"/>
+        </w:numPr>
+        <w:spacing w:after="80" w:line="340"/>
+      </w:pPr>
+      <w:r>
+        <w:rPr>
+          <w:sz w:val="24"/>
+          <w:szCs w:val="24"/>
+        </w:rPr>
+        <w:t xml:space="preserve">文件系统做了一层抽象，支持本地和OSS双模式切换，Excel导入导出和PDF生成也都能跑通。</w:t>
       </w:r>
     </w:p>
     <w:p>
@@ -664,7 +664,7 @@
           <w:sz w:val="24"/>
           <w:szCs w:val="24"/>
         </w:rPr>
-        <w:t xml:space="preserve">独立开发了一个像素赛博朋克风格的个人简历与信息主页网站，已部署上线（https://chisa-official-self-web.netlify.app/）。</w:t>
+        <w:t xml:space="preserve">这是我给自己做的一个个人简历网站，走的是像素赛博朋克风格，目前已经部署上线了（https://chisa-official-self-web.netlify.app/）。</w:t>
       </w:r>
     </w:p>
     <w:p>
@@ -687,7 +687,7 @@
           <w:sz w:val="24"/>
           <w:szCs w:val="24"/>
         </w:rPr>
-        <w:t xml:space="preserve">纯HTML/CSS/JavaScript，无任何构建工具或框架依赖。</w:t>
+        <w:t xml:space="preserve">纯HTML、CSS、JavaScript，没有用任何构建工具或框架。选这条路是想锻炼一下原生写法，也省去打包部署的麻烦。</w:t>
       </w:r>
     </w:p>
     <w:p>
@@ -727,75 +727,75 @@
           <w:sz w:val="24"/>
           <w:szCs w:val="24"/>
         </w:rPr>
-        <w:t xml:space="preserve">视觉设计：CRT扫描线叠加、网格背景、辉光效果、终端启动动画等像素赛博朋克视觉元素。</w:t>
-      </w:r>
-    </w:p>
-    <w:p>
-      <w:pPr>
-        <w:pStyle w:val="ListParagraph"/>
-        <w:numPr>
-          <w:ilvl w:val="0"/>
-          <w:numId w:val="2"/>
-        </w:numPr>
-        <w:spacing w:after="80" w:line="340"/>
-      </w:pPr>
-      <w:r>
-        <w:rPr>
-          <w:sz w:val="24"/>
-          <w:szCs w:val="24"/>
-        </w:rPr>
-        <w:t xml:space="preserve">国际化：基于data-i18n属性与JS字典实现完整的中英文双语切换系统，语言偏好持久化到localStorage。</w:t>
-      </w:r>
-    </w:p>
-    <w:p>
-      <w:pPr>
-        <w:pStyle w:val="ListParagraph"/>
-        <w:numPr>
-          <w:ilvl w:val="0"/>
-          <w:numId w:val="2"/>
-        </w:numPr>
-        <w:spacing w:after="80" w:line="340"/>
-      </w:pPr>
-      <w:r>
-        <w:rPr>
-          <w:sz w:val="24"/>
-          <w:szCs w:val="24"/>
-        </w:rPr>
-        <w:t xml:space="preserve">响应式布局：适配桌面、平板、手机三档断点，确保各终端良好体验。</w:t>
-      </w:r>
-    </w:p>
-    <w:p>
-      <w:pPr>
-        <w:pStyle w:val="ListParagraph"/>
-        <w:numPr>
-          <w:ilvl w:val="0"/>
-          <w:numId w:val="2"/>
-        </w:numPr>
-        <w:spacing w:after="80" w:line="340"/>
-      </w:pPr>
-      <w:r>
-        <w:rPr>
-          <w:sz w:val="24"/>
-          <w:szCs w:val="24"/>
-        </w:rPr>
-        <w:t xml:space="preserve">交互动画：基于IntersectionObserver实现滚动渐入动画、导航高亮联动、鼠标视差效果。</w:t>
-      </w:r>
-    </w:p>
-    <w:p>
-      <w:pPr>
-        <w:pStyle w:val="ListParagraph"/>
-        <w:numPr>
-          <w:ilvl w:val="0"/>
-          <w:numId w:val="2"/>
-        </w:numPr>
-        <w:spacing w:after="80" w:line="340"/>
-      </w:pPr>
-      <w:r>
-        <w:rPr>
-          <w:sz w:val="24"/>
-          <w:szCs w:val="24"/>
-        </w:rPr>
-        <w:t xml:space="preserve">无障碍支持：通过prefers-reduced-motion媒体查询尊重用户系统动画偏好。</w:t>
+        <w:t xml:space="preserve">视觉上做了CRT扫描线叠加、网格背景、辉光效果、终端启动动画这些像素赛博朋克的标志性元素。</w:t>
+      </w:r>
+    </w:p>
+    <w:p>
+      <w:pPr>
+        <w:pStyle w:val="ListParagraph"/>
+        <w:numPr>
+          <w:ilvl w:val="0"/>
+          <w:numId w:val="2"/>
+        </w:numPr>
+        <w:spacing w:after="80" w:line="340"/>
+      </w:pPr>
+      <w:r>
+        <w:rPr>
+          <w:sz w:val="24"/>
+          <w:szCs w:val="24"/>
+        </w:rPr>
+        <w:t xml:space="preserve">国际化用data-i18n属性配合JS字典实现，中英文双语切换完整覆盖，语言偏好存到localStorage里，刷新不丢。</w:t>
+      </w:r>
+    </w:p>
+    <w:p>
+      <w:pPr>
+        <w:pStyle w:val="ListParagraph"/>
+        <w:numPr>
+          <w:ilvl w:val="0"/>
+          <w:numId w:val="2"/>
+        </w:numPr>
+        <w:spacing w:after="80" w:line="340"/>
+      </w:pPr>
+      <w:r>
+        <w:rPr>
+          <w:sz w:val="24"/>
+          <w:szCs w:val="24"/>
+        </w:rPr>
+        <w:t xml:space="preserve">响应式布局适配桌面、平板、手机三个档位，不同屏幕下体验都不差。</w:t>
+      </w:r>
+    </w:p>
+    <w:p>
+      <w:pPr>
+        <w:pStyle w:val="ListParagraph"/>
+        <w:numPr>
+          <w:ilvl w:val="0"/>
+          <w:numId w:val="2"/>
+        </w:numPr>
+        <w:spacing w:after="80" w:line="340"/>
+      </w:pPr>
+      <w:r>
+        <w:rPr>
+          <w:sz w:val="24"/>
+          <w:szCs w:val="24"/>
+        </w:rPr>
+        <w:t xml:space="preserve">交互动画靠IntersectionObserver实现滚动渐入，导航高亮联动和鼠标视差效果也加上了。</w:t>
+      </w:r>
+    </w:p>
+    <w:p>
+      <w:pPr>
+        <w:pStyle w:val="ListParagraph"/>
+        <w:numPr>
+          <w:ilvl w:val="0"/>
+          <w:numId w:val="2"/>
+        </w:numPr>
+        <w:spacing w:after="80" w:line="340"/>
+      </w:pPr>
+      <w:r>
+        <w:rPr>
+          <w:sz w:val="24"/>
+          <w:szCs w:val="24"/>
+        </w:rPr>
+        <w:t xml:space="preserve">无障碍方面，通过prefers-reduced-motion媒体查询来尊重用户的系统动画偏好设置，这在多数情况下是个容易被忽略但该考虑的细节。</w:t>
       </w:r>
     </w:p>
     <w:p>
@@ -848,7 +848,7 @@
           <w:sz w:val="24"/>
           <w:szCs w:val="24"/>
         </w:rPr>
-        <w:t xml:space="preserve">为61键60%全透明亚克力机械键盘生成电商级别的纯白底产品图。键盘特征为冰裂纹镂空侧面结构，整壳由全透明无色亚克力材质制成。</w:t>
+        <w:t xml:space="preserve">这个任务的目标，是用AI给一把61键的透明亚克力机械键盘出电商白底图。键盘本身比较有特点——冰裂纹镂空侧面，整壳是全透明无色亚克力，看起来漂亮但拍起来难。</w:t>
       </w:r>
     </w:p>
     <w:p>
@@ -888,41 +888,41 @@
           <w:sz w:val="24"/>
           <w:szCs w:val="24"/>
         </w:rPr>
-        <w:t xml:space="preserve">GPT Image 2.0方案：通过中转站API调用OpenAI GPT Image 2模型，编写三个视角的英文提示词（近景拔轴特写、正面平视微俯、45度斜俯全貌），经多次迭代调优进行生成尝试。</w:t>
-      </w:r>
-    </w:p>
-    <w:p>
-      <w:pPr>
-        <w:pStyle w:val="ListParagraph"/>
-        <w:numPr>
-          <w:ilvl w:val="0"/>
-          <w:numId w:val="2"/>
-        </w:numPr>
-        <w:spacing w:after="80" w:line="340"/>
-      </w:pPr>
-      <w:r>
-        <w:rPr>
-          <w:sz w:val="24"/>
-          <w:szCs w:val="24"/>
-        </w:rPr>
-        <w:t xml:space="preserve">豆包生图方案：使用字节跳动豆包AI图像服务生成白底精修图作为补充素材。</w:t>
-      </w:r>
-    </w:p>
-    <w:p>
-      <w:pPr>
-        <w:pStyle w:val="ListParagraph"/>
-        <w:numPr>
-          <w:ilvl w:val="0"/>
-          <w:numId w:val="2"/>
-        </w:numPr>
-        <w:spacing w:after="80" w:line="340"/>
-      </w:pPr>
-      <w:r>
-        <w:rPr>
-          <w:sz w:val="24"/>
-          <w:szCs w:val="24"/>
-        </w:rPr>
-        <w:t xml:space="preserve">自动化脚本：编写Python脚本封装API调用流程（创建任务→轮询等待→下载图片），并实现自动重试机制应对服务波动。</w:t>
+        <w:t xml:space="preserve">GPT Image 2.0这条路，我通过中转站API调OpenAI的模型，写了三组英文提示词分别对应三个视角：近景拔轴特写、正面平视微俯、45度斜俯全貌。反复调了好几轮提示词来做生成尝试。</w:t>
+      </w:r>
+    </w:p>
+    <w:p>
+      <w:pPr>
+        <w:pStyle w:val="ListParagraph"/>
+        <w:numPr>
+          <w:ilvl w:val="0"/>
+          <w:numId w:val="2"/>
+        </w:numPr>
+        <w:spacing w:after="80" w:line="340"/>
+      </w:pPr>
+      <w:r>
+        <w:rPr>
+          <w:sz w:val="24"/>
+          <w:szCs w:val="24"/>
+        </w:rPr>
+        <w:t xml:space="preserve">豆包生图作为补充手段，用字节跳动的AI图像服务跑了一些白底精修图。</w:t>
+      </w:r>
+    </w:p>
+    <w:p>
+      <w:pPr>
+        <w:pStyle w:val="ListParagraph"/>
+        <w:numPr>
+          <w:ilvl w:val="0"/>
+          <w:numId w:val="2"/>
+        </w:numPr>
+        <w:spacing w:after="80" w:line="340"/>
+      </w:pPr>
+      <w:r>
+        <w:rPr>
+          <w:sz w:val="24"/>
+          <w:szCs w:val="24"/>
+        </w:rPr>
+        <w:t xml:space="preserve">我还写了一套Python脚本把API调用流程封起来——创建任务、轮询等待、下载图片一气呵成，加了个自动重试机制来对付服务不稳定的情况。</w:t>
       </w:r>
     </w:p>
     <w:p>
@@ -945,7 +945,7 @@
           <w:sz w:val="24"/>
           <w:szCs w:val="24"/>
         </w:rPr>
-        <w:t xml:space="preserve">由于全透明亚克力材质的还原难度较高，AI生成效果未达到预期标准，项目未完成全部成品，仅产出部分白底样例图作为阶段性探索成果。</w:t>
+        <w:t xml:space="preserve">老实说，透明亚克力这种材质的还原难度超出了我的预期。AI出图的效果始终没能达到电商上架的标准，最后只留下几张白底样例图作为阶段性探索的记录。这个项目让我意识到，AI文生图在复杂透明材质场景下还有很长的路要走。</w:t>
       </w:r>
     </w:p>
     <w:p>
@@ -983,7 +983,7 @@
           <w:sz w:val="24"/>
           <w:szCs w:val="24"/>
         </w:rPr>
-        <w:t xml:space="preserve">该项目旨在为桌面宠物应用生成一系列透明背景的角色动图，涵盖角色特征反推、精灵图生成、动图合成等环节。项目暂未完成，期间进行了多种动图实现方案的尝试（包括GIF动画和PNG序列帧动画等），但均因效果不达标而被淘汰。项目最终的有效成果集中在角色提示词工程方面。</w:t>
+        <w:t xml:space="preserve">这个项目的想法是给桌面宠物应用做一套透明背景的角色动图。整个流程涉及角色特征反推、精灵图生成、动图合成几个环节。项目目前没有完成。中间我试了好几种动图实现方案，但出来的效果都不够好，全被淘汰了。真正能留下来的有效成果，是角色提示词工程那一块的工作。</w:t>
       </w:r>
     </w:p>
     <w:p>
@@ -1023,24 +1023,24 @@
           <w:sz w:val="24"/>
           <w:szCs w:val="24"/>
         </w:rPr>
-        <w:t xml:space="preserve">GIF动画方案：尝试通过精灵图拆帧后合成透明GIF动画，但受限于GIF格式先天不足（256色索引、1-bit alpha、低帧率），生成的动图存在边缘锯齿、色彩损失和帧率卡顿等问题，最终被淘汰。</w:t>
-      </w:r>
-    </w:p>
-    <w:p>
-      <w:pPr>
-        <w:pStyle w:val="ListParagraph"/>
-        <w:numPr>
-          <w:ilvl w:val="0"/>
-          <w:numId w:val="2"/>
-        </w:numPr>
-        <w:spacing w:after="80" w:line="340"/>
-      </w:pPr>
-      <w:r>
-        <w:rPr>
-          <w:sz w:val="24"/>
-          <w:szCs w:val="24"/>
-        </w:rPr>
-        <w:t xml:space="preserve">PNG序列帧方案（方案C）：尝试以PNG序列帧替代GIF，利用PNG原生8-bit Alpha解决边缘锯齿，帧率提升至15fps，但在实际渲染流程中清晰度仍未达到预期标准，同样被淘汰。</w:t>
+        <w:t xml:space="preserve">GIF动画方案是最先试的。把精灵图拆帧后合成透明GIF，但GIF这个格式本身就有先天缺陷——256色索引、1-bit alpha、帧率上不去。跑出来的动图边缘全是锯齿，颜色也不对，帧率卡顿得没法看，只能放弃。</w:t>
+      </w:r>
+    </w:p>
+    <w:p>
+      <w:pPr>
+        <w:pStyle w:val="ListParagraph"/>
+        <w:numPr>
+          <w:ilvl w:val="0"/>
+          <w:numId w:val="2"/>
+        </w:numPr>
+        <w:spacing w:after="80" w:line="340"/>
+      </w:pPr>
+      <w:r>
+        <w:rPr>
+          <w:sz w:val="24"/>
+          <w:szCs w:val="24"/>
+        </w:rPr>
+        <w:t xml:space="preserve">后来换了PNG序列帧方案，用PNG原生8-bit Alpha来解决边缘锯齿，帧率也提到了15fps。但在实际渲染过程中，清晰度依然没有达到可接受的水平，这条路也没走通。</w:t>
       </w:r>
     </w:p>
     <w:p>
@@ -1080,58 +1080,58 @@
           <w:sz w:val="24"/>
           <w:szCs w:val="24"/>
         </w:rPr>
-        <w:t xml:space="preserve">反推角色特征的提示词Skill：开发了一套可复用的提示词工程技能，通过分析角色素材（立绘、Q版表情包等）自动反推角色的颜色、结构、服饰、瞳色等特征描述，形成标准化的角色特征提示词生成流程。</w:t>
-      </w:r>
-    </w:p>
-    <w:p>
-      <w:pPr>
-        <w:pStyle w:val="ListParagraph"/>
-        <w:numPr>
-          <w:ilvl w:val="0"/>
-          <w:numId w:val="2"/>
-        </w:numPr>
-        <w:spacing w:after="80" w:line="340"/>
-      </w:pPr>
-      <w:r>
-        <w:rPr>
-          <w:sz w:val="24"/>
-          <w:szCs w:val="24"/>
-        </w:rPr>
-        <w:t xml:space="preserve">角色特征提示词：成功反推了爱弥斯、达妮娅等角色的完整特征提示词，涵盖分区主色分析（发色、眼色、躯干、鞋靴等精确RGB聚类）、头身比剖面、眼框扫描等内容。</w:t>
-      </w:r>
-    </w:p>
-    <w:p>
-      <w:pPr>
-        <w:pStyle w:val="ListParagraph"/>
-        <w:numPr>
-          <w:ilvl w:val="0"/>
-          <w:numId w:val="2"/>
-        </w:numPr>
-        <w:spacing w:after="80" w:line="340"/>
-      </w:pPr>
-      <w:r>
-        <w:rPr>
-          <w:sz w:val="24"/>
-          <w:szCs w:val="24"/>
-        </w:rPr>
-        <w:t xml:space="preserve">角色动作提示词：编写了行走、探头、工作、待机、开机、关机等多种角色动作的精灵图生成提示词，采用固定模板（基底描述+网格说明+逐帧描述），并通过多次迭代优化了提示词的还原度。</w:t>
-      </w:r>
-    </w:p>
-    <w:p>
-      <w:pPr>
-        <w:pStyle w:val="ListParagraph"/>
-        <w:numPr>
-          <w:ilvl w:val="0"/>
-          <w:numId w:val="2"/>
-        </w:numPr>
-        <w:spacing w:after="80" w:line="340"/>
-      </w:pPr>
-      <w:r>
-        <w:rPr>
-          <w:sz w:val="24"/>
-          <w:szCs w:val="24"/>
-        </w:rPr>
-        <w:t xml:space="preserve">辅助分析脚本：编写了OCR文字提取、素材主色分析、细化颜色聚类、结构剖面分析等Python辅助脚本，为角色特征反推提供数据支撑。</w:t>
+        <w:t xml:space="preserve">我做了一套反推角色特征的提示词Skill。简单说就是输入角色素材（立绘、Q版表情包之类的），它能自动分析出角色的颜色、结构、服饰、瞳色这些特征，生成一段标准化的特征描述提示词。</w:t>
+      </w:r>
+    </w:p>
+    <w:p>
+      <w:pPr>
+        <w:pStyle w:val="ListParagraph"/>
+        <w:numPr>
+          <w:ilvl w:val="0"/>
+          <w:numId w:val="2"/>
+        </w:numPr>
+        <w:spacing w:after="80" w:line="340"/>
+      </w:pPr>
+      <w:r>
+        <w:rPr>
+          <w:sz w:val="24"/>
+          <w:szCs w:val="24"/>
+        </w:rPr>
+        <w:t xml:space="preserve">用这套方法成功反推了爱弥斯和达妮娅两个角色的完整特征提示词。分析内容挺细的——分区主色聚类（发色、眼色、躯干、鞋靴各自的精确RGB值）、头身比剖面、眼框扫描这些都做了。</w:t>
+      </w:r>
+    </w:p>
+    <w:p>
+      <w:pPr>
+        <w:pStyle w:val="ListParagraph"/>
+        <w:numPr>
+          <w:ilvl w:val="0"/>
+          <w:numId w:val="2"/>
+        </w:numPr>
+        <w:spacing w:after="80" w:line="340"/>
+      </w:pPr>
+      <w:r>
+        <w:rPr>
+          <w:sz w:val="24"/>
+          <w:szCs w:val="24"/>
+        </w:rPr>
+        <w:t xml:space="preserve">动作提示词也写了一批：行走、探头、工作、待机、开机、关机这些状态各有一组。格式上用的是固定模板——基底描述加网格说明加逐帧描述，反复迭代了几轮来提高还原度。</w:t>
+      </w:r>
+    </w:p>
+    <w:p>
+      <w:pPr>
+        <w:pStyle w:val="ListParagraph"/>
+        <w:numPr>
+          <w:ilvl w:val="0"/>
+          <w:numId w:val="2"/>
+        </w:numPr>
+        <w:spacing w:after="80" w:line="340"/>
+      </w:pPr>
+      <w:r>
+        <w:rPr>
+          <w:sz w:val="24"/>
+          <w:szCs w:val="24"/>
+        </w:rPr>
+        <w:t xml:space="preserve">另外还写了些辅助分析脚本，做OCR文字提取、素材主色分析、细化颜色聚类、结构剖面分析这些事，给反推工作提供数据上的支撑。</w:t>
       </w:r>
     </w:p>
     <w:p>
@@ -1160,7 +1160,7 @@
           <w:sz w:val="24"/>
           <w:szCs w:val="24"/>
         </w:rPr>
-        <w:t xml:space="preserve">协助公司同事前往松山湖为企业进行实地资产收集工作，了解企业IT资产管理的基本流程和规范要求，积累了实地勘察和数据登记的实践经验。</w:t>
+        <w:t xml:space="preserve">实习期间我还跟着同事去了一趟松山湖，给一家企业做实地资产收集。说白了就是上门盘点IT设备、登记资产信息。这个活儿看着简单，但做起来才发现企业IT资产管理的流程和规范有不少门道。实地勘察、数据登记这些环节，坐在办公室里是体会不到的。</w:t>
       </w:r>
     </w:p>
     <w:p>
@@ -1189,7 +1189,7 @@
           <w:sz w:val="24"/>
           <w:szCs w:val="24"/>
         </w:rPr>
-        <w:t xml:space="preserve">深入学习企业网络安全同事在实践过程中发现的真实漏洞案例，涵盖常见Web安全漏洞（如SQL注入、XSS、CSRF等）的原理与防范措施。通过分析实际安全事件，提高了作为开发者的编码安全意识，理解了安全开发规范的重要性，并在后续的项目开发中自觉遵循安全编码最佳实践。</w:t>
+        <w:t xml:space="preserve">网安团队在工作中碰到的真实漏洞案例，我也拿来研究了一番。SQL注入、XSS、CSRF这些Web安全的老问题，课本上讲得笼统，但看到真实的攻击路径和修复过程之后，理解完全不一样了。做了开发之后再看这些案例，你会发现写代码的时候多一道校验、多一层权限控制，可能就堵住了一个大口子。后续开发学生管理系统的时候，输入校验和权限控制这些我就做得比较自觉了。</w:t>
       </w:r>
     </w:p>
     <w:p>
@@ -1220,106 +1220,106 @@
           <w:sz w:val="24"/>
           <w:szCs w:val="24"/>
         </w:rPr>
-        <w:t xml:space="preserve">1. 全栈开发能力显著提升。</w:t>
-      </w:r>
-      <w:r>
-        <w:rPr>
-          <w:sz w:val="24"/>
-          <w:szCs w:val="24"/>
-        </w:rPr>
-        <w:t xml:space="preserve">通过独立开发高校学生管理系统，系统掌握了Vue 3 + Node.js + Express + Prisma + MySQL技术栈，从需求分析、数据库设计、接口开发到前端实现，完整经历了一个企业级全栈项目的全生命周期。</w:t>
-      </w:r>
-    </w:p>
-    <w:p>
-      <w:pPr>
-        <w:spacing w:after="120" w:line="360"/>
-        <w:ind w:firstLine="480"/>
-        <w:jc w:val="both"/>
-      </w:pPr>
-      <w:r>
-        <w:rPr>
-          <w:b/>
-          <w:bCs/>
-          <w:sz w:val="24"/>
-          <w:szCs w:val="24"/>
-        </w:rPr>
-        <w:t xml:space="preserve">2. AIGC提示词工程与AI图像生成探索。</w:t>
-      </w:r>
-      <w:r>
-        <w:rPr>
-          <w:sz w:val="24"/>
-          <w:szCs w:val="24"/>
-        </w:rPr>
-        <w:t xml:space="preserve">在AIGC方向，掌握了文生图API调用、提示词工程、图像后处理等核心技术。虽然键盘电商图和桌宠动图两个项目因技术难度较高未能全部完成，但通过反复的迭代调优和失败方案分析，积累了宝贵的提示词工程经验，特别是角色特征反推和动作提示词设计方面形成了可复用的方法论。</w:t>
-      </w:r>
-    </w:p>
-    <w:p>
-      <w:pPr>
-        <w:spacing w:after="120" w:line="360"/>
-        <w:ind w:firstLine="480"/>
-        <w:jc w:val="both"/>
-      </w:pPr>
-      <w:r>
-        <w:rPr>
-          <w:b/>
-          <w:bCs/>
-          <w:sz w:val="24"/>
-          <w:szCs w:val="24"/>
-        </w:rPr>
-        <w:t xml:space="preserve">3. 工程化思维与文档习惯。</w:t>
-      </w:r>
-      <w:r>
-        <w:rPr>
-          <w:sz w:val="24"/>
-          <w:szCs w:val="24"/>
-        </w:rPr>
-        <w:t xml:space="preserve">实习期间为每个项目编写了详细的项目交接文档，涵盖技术架构、模块详解、工作流程、已知问题和维护指南等内容，培养了良好的工程文档习惯和项目交接意识。</w:t>
-      </w:r>
-    </w:p>
-    <w:p>
-      <w:pPr>
-        <w:spacing w:after="120" w:line="360"/>
-        <w:ind w:firstLine="480"/>
-        <w:jc w:val="both"/>
-      </w:pPr>
-      <w:r>
-        <w:rPr>
-          <w:b/>
-          <w:bCs/>
-          <w:sz w:val="24"/>
-          <w:szCs w:val="24"/>
-        </w:rPr>
-        <w:t xml:space="preserve">4. 安全编码意识。</w:t>
-      </w:r>
-      <w:r>
-        <w:rPr>
-          <w:sz w:val="24"/>
-          <w:szCs w:val="24"/>
-        </w:rPr>
-        <w:t xml:space="preserve">通过学习网络安全实战案例，深刻认识到安全编码的重要性，在后续开发中自觉进行输入校验、权限控制、敏感数据保护等安全实践。</w:t>
-      </w:r>
-    </w:p>
-    <w:p>
-      <w:pPr>
-        <w:spacing w:after="120" w:line="360"/>
-        <w:ind w:firstLine="480"/>
-        <w:jc w:val="both"/>
-      </w:pPr>
-      <w:r>
-        <w:rPr>
-          <w:b/>
-          <w:bCs/>
-          <w:sz w:val="24"/>
-          <w:szCs w:val="24"/>
-        </w:rPr>
-        <w:t xml:space="preserve">5. 团队协作与职业素养。</w:t>
-      </w:r>
-      <w:r>
-        <w:rPr>
-          <w:sz w:val="24"/>
-          <w:szCs w:val="24"/>
-        </w:rPr>
-        <w:t xml:space="preserve">在参与企业资产收集等工作中，锻炼了沟通协调能力和团队协作精神，了解了企业实际运作流程和职业规范。</w:t>
+        <w:t xml:space="preserve">1. 全栈开发能力上了一个台阶。</w:t>
+      </w:r>
+      <w:r>
+        <w:rPr>
+          <w:sz w:val="24"/>
+          <w:szCs w:val="24"/>
+        </w:rPr>
+        <w:t xml:space="preserve">学生管理系统这个项目从需求分析、数据库设计、接口开发到前端实现，我一个人走了一遍全流程。Vue 3加Node.js这套技术栈，以前只是课上听过，现在是真刀真枪地用过了。遇到问题查文档、翻源码、调试解决，这种经验是看教程替代不了的。</w:t>
+      </w:r>
+    </w:p>
+    <w:p>
+      <w:pPr>
+        <w:spacing w:after="120" w:line="360"/>
+        <w:ind w:firstLine="480"/>
+        <w:jc w:val="both"/>
+      </w:pPr>
+      <w:r>
+        <w:rPr>
+          <w:b/>
+          <w:bCs/>
+          <w:sz w:val="24"/>
+          <w:szCs w:val="24"/>
+        </w:rPr>
+        <w:t xml:space="preserve">2. AIGC方面摸索出了一些门道。</w:t>
+      </w:r>
+      <w:r>
+        <w:rPr>
+          <w:sz w:val="24"/>
+          <w:szCs w:val="24"/>
+        </w:rPr>
+        <w:t xml:space="preserve">文生图API怎么调、提示词怎么写、图出来之后怎么后处理，这些核心技术都实操过了。键盘图和桌宠动图两个项目虽然都没能收尾，但反复试错的过程本身就是一种积累。角色特征反推和动作提示词设计这两块，我算是摸出了一套自己的方法论，以后碰到类似的需求可以直接复用。</w:t>
+      </w:r>
+    </w:p>
+    <w:p>
+      <w:pPr>
+        <w:spacing w:after="120" w:line="360"/>
+        <w:ind w:firstLine="480"/>
+        <w:jc w:val="both"/>
+      </w:pPr>
+      <w:r>
+        <w:rPr>
+          <w:b/>
+          <w:bCs/>
+          <w:sz w:val="24"/>
+          <w:szCs w:val="24"/>
+        </w:rPr>
+        <w:t xml:space="preserve">3. 工程化思维和文档习惯养成了。</w:t>
+      </w:r>
+      <w:r>
+        <w:rPr>
+          <w:sz w:val="24"/>
+          <w:szCs w:val="24"/>
+        </w:rPr>
+        <w:t xml:space="preserve">每个项目做完我都会写一份交接文档，技术架构怎么搭的、各模块怎么分的、工作流程是什么样的、已知问题有哪些、后续怎么维护——这些内容都记录下来。这可能是实习期间养成的最有用的习惯之一，因为代码写完不等于项目结束，得让别人能接得住。</w:t>
+      </w:r>
+    </w:p>
+    <w:p>
+      <w:pPr>
+        <w:spacing w:after="120" w:line="360"/>
+        <w:ind w:firstLine="480"/>
+        <w:jc w:val="both"/>
+      </w:pPr>
+      <w:r>
+        <w:rPr>
+          <w:b/>
+          <w:bCs/>
+          <w:sz w:val="24"/>
+          <w:szCs w:val="24"/>
+        </w:rPr>
+        <w:t xml:space="preserve">4. 安全编码的意识变强了。</w:t>
+      </w:r>
+      <w:r>
+        <w:rPr>
+          <w:sz w:val="24"/>
+          <w:szCs w:val="24"/>
+        </w:rPr>
+        <w:t xml:space="preserve">看过网安团队的真实漏洞案例后，写代码的时候心态变了。输入校验该做的做、权限控制该加的加、敏感数据该保护的保护。这些事情课本上也在讲，但看过真实攻击路径之后，重视程度完全不同。</w:t>
+      </w:r>
+    </w:p>
+    <w:p>
+      <w:pPr>
+        <w:spacing w:after="120" w:line="360"/>
+        <w:ind w:firstLine="480"/>
+        <w:jc w:val="both"/>
+      </w:pPr>
+      <w:r>
+        <w:rPr>
+          <w:b/>
+          <w:bCs/>
+          <w:sz w:val="24"/>
+          <w:szCs w:val="24"/>
+        </w:rPr>
+        <w:t xml:space="preserve">5. 沟通和协作方面也有收获。</w:t>
+      </w:r>
+      <w:r>
+        <w:rPr>
+          <w:sz w:val="24"/>
+          <w:szCs w:val="24"/>
+        </w:rPr>
+        <w:t xml:space="preserve">去松山湖做资产收集的那次，需要跟企业方对接、跟同事配合。这种实地沟通协调的经历，和在学校做课程项目时的组队合作不是一回事。企业里的流程怎么走、规范怎么执行，这些感受是坐在工位上写代码学不到的。</w:t>
       </w:r>
     </w:p>
     <w:p>
@@ -1348,21 +1348,21 @@
           <w:sz w:val="24"/>
           <w:szCs w:val="24"/>
         </w:rPr>
-        <w:t xml:space="preserve">本次暑期实习是一次从课堂理论到工程实践的重要跨越。在广东创科安全科技有限公司实习期间，chisa.official同学在AI编程、AIGC图像生成、企业资产收集和网络安全学习四个方向均开展了深入实践。在AI编程方面，独立开发了高校学生管理系统和个人主页网站两个完整项目；在AIGC方面，围绕键盘电商图和桌宠动图两个项目进行了AI图像生成的探索，虽因技术难度较高未全部完成，但积累了丰富的提示词工程经验和失败方案分析能力；同时参与了企业资产收集工作并深入学习了网络安全实践知识。整体而言，本次实习显著提升了全栈开发能力和AI工程化探索能力。</w:t>
-      </w:r>
-    </w:p>
-    <w:p>
-      <w:pPr>
-        <w:spacing w:after="120" w:line="360"/>
-        <w:ind w:firstLine="480"/>
-        <w:jc w:val="both"/>
-      </w:pPr>
-      <w:r>
-        <w:rPr>
-          <w:sz w:val="24"/>
-          <w:szCs w:val="24"/>
-        </w:rPr>
-        <w:t xml:space="preserve">展望未来，将继续深入学习人工智能应用落地方向，重点探索AI Agent、AIGC创作和AI自动化办公等领域，将实习期间积累的技术能力和工程经验持续转化为实际生产力，为成为优秀的AI应用工程师奠定坚实基础。</w:t>
+        <w:t xml:space="preserve">回头看这两个多月的实习，算是完成了从课堂到工程实践的一次跨越。在广东创科安全科技有限公司，我在四个方向上都动了手：AI编程这边独立做了学生管理系统和个人主页两个项目，AIGC这边在键盘图和桌宠动图两个项目上做了探索（虽然都没能全部完成，但提示词工程方面的积累是实打实的），资产收集跟着跑了一趟实地，网络安全方面也认真研究了真实案例。整体下来，全栈开发能力和AI工程化探索能力这两条线，进步是明显的。</w:t>
+      </w:r>
+    </w:p>
+    <w:p>
+      <w:pPr>
+        <w:spacing w:after="120" w:line="360"/>
+        <w:ind w:firstLine="480"/>
+        <w:jc w:val="both"/>
+      </w:pPr>
+      <w:r>
+        <w:rPr>
+          <w:sz w:val="24"/>
+          <w:szCs w:val="24"/>
+        </w:rPr>
+        <w:t xml:space="preserve">接下来我的学习方向会比较聚焦——AI Agent、AIGC创作和AI自动化办公这几个领域想深入下去。实习期间积累的技术能力和工程经验，我想把它们一步步转化成实际能用的东西。chisa.official同学目前还是一名准大二学生，离真正合格的AI应用工程师还有一段路要走，但这次实习至少让我知道了自己的能力边界在哪里、该往哪个方向使劲。</w:t>
       </w:r>
     </w:p>
     <w:sectPr>

</xml_diff>

<commit_message>
Update docx: fix job title, security section, character names, first person
</commit_message>
<xml_diff>
--- a/assets/实习总结_chisa.official.docx
+++ b/assets/实习总结_chisa.official.docx
@@ -223,7 +223,7 @@
                 <w:sz w:val="22"/>
                 <w:szCs w:val="22"/>
               </w:rPr>
-              <w:t xml:space="preserve">人工智能应用助理</w:t>
+              <w:t xml:space="preserve">实习生</w:t>
             </w:r>
           </w:p>
         </w:tc>
@@ -288,7 +288,7 @@
                 <w:sz w:val="22"/>
                 <w:szCs w:val="22"/>
               </w:rPr>
-              <w:t xml:space="preserve">2026年暑期</w:t>
+              <w:t xml:space="preserve">2026年8月</w:t>
             </w:r>
           </w:p>
         </w:tc>
@@ -393,7 +393,7 @@
           <w:sz w:val="24"/>
           <w:szCs w:val="24"/>
         </w:rPr>
-        <w:t xml:space="preserve">今年暑假，我进入广东创科安全科技有限公司实习，岗位是人工智能应用助理。整个实习过程围绕四条主线展开：AI编程、AIGC图像生成、企业资产收集，还有网络安全方面的学习。编程这条线上，我一个人扛下来两件事——一套高校学生管理系统和一个个人主页网站。AIGC这边做了两个项目，一个是透明亚克力键盘的电商白底图，另一个是桌宠角色动图。说起来，这两个项目的推进过程并不像预想中那样顺利。键盘图因为透明材质的还原难度超出了预期，到实习结束也只完成了几张白底样例；桌宠动图尝试了好几种技术路径，但出来的效果始终不达标，最后真正能拿出来的成果是一套角色特征反推的提示词工程方法。此外，我还跟着同事去松山湖做了一次企业资产实地收集，也花时间研究了网安团队在工作中遇到的真实漏洞案例。这段实习让我把课堂上的东西真正用到了工程场景里，全栈开发和AI应用两方面的动手能力都有了明显的进步。</w:t>
+        <w:t xml:space="preserve">今年八月，我进入广东创科安全科技有限公司实习，岗位是实习生。虽然只有一个月的时间，但实习内容覆盖了四条线：AI编程、AIGC图像生成、企业资产收集，还有网络安全方面的学习。编程这条线上，我一个人扛下来两件事——一套高校学生管理系统和一个个人主页网站。AIGC这边做了两个项目，一个是透明亚克力键盘的电商白底图，另一个是桌宠角色动图。说起来，这两个项目的推进过程并不像预想中那样顺利。键盘图因为透明材质的还原难度超出了预期，到实习结束也只完成了几张白底样例；桌宠动图尝试了好几种技术路径，但出来的效果始终不达标，最后真正能拿出来的成果是一套角色特征反推的提示词工程方法。此外，我还跟着同事去松山湖做了一次企业资产实地收集，也第一次接触了网络安全方面的知识。这段实习让我把课堂上的东西真正用到了工程场景里，全栈开发和AI应用两方面的动手能力都有了明显的进步。</w:t>
       </w:r>
     </w:p>
     <w:p>
@@ -1097,7 +1097,7 @@
           <w:sz w:val="24"/>
           <w:szCs w:val="24"/>
         </w:rPr>
-        <w:t xml:space="preserve">用这套方法成功反推了爱弥斯和达妮娅两个角色的完整特征提示词。分析内容挺细的——分区主色聚类（发色、眼色、躯干、鞋靴各自的精确RGB值）、头身比剖面、眼框扫描这些都做了。</w:t>
+        <w:t xml:space="preserve">用这套方法成功反推了两个角色的完整特征提示词。分析内容挺细的——分区主色聚类（发色、眼色、躯干、鞋靴各自的精确RGB值）、头身比剖面、眼框扫描这些都做了。</w:t>
       </w:r>
     </w:p>
     <w:p>
@@ -1189,7 +1189,7 @@
           <w:sz w:val="24"/>
           <w:szCs w:val="24"/>
         </w:rPr>
-        <w:t xml:space="preserve">网安团队在工作中碰到的真实漏洞案例，我也拿来研究了一番。SQL注入、XSS、CSRF这些Web安全的老问题，课本上讲得笼统，但看到真实的攻击路径和修复过程之后，理解完全不一样了。做了开发之后再看这些案例，你会发现写代码的时候多一道校验、多一层权限控制，可能就堵住了一个大口子。后续开发学生管理系统的时候，输入校验和权限控制这些我就做得比较自觉了。</w:t>
+        <w:t xml:space="preserve">网络安全对我来说是一个全新的领域，之前完全没有接触过。实习期间，我跟着网安团队的同事了解了他们在工作中遇到的真实漏洞案例。看到攻击者是怎么找到系统薄弱环节的，又是怎么利用这些漏洞的，这个过程对我冲击挺大的。以前写代码的时候脑子里基本没有安全这根弦，看了这些案例之后才意识到，很多安全问题其实就在日常开发的细节里——一个没做校验的输入框、一个没控制好的权限，都可能被钻空子。后来开发学生管理系统的时候，我在输入校验和权限控制上就比以前自觉多了。</w:t>
       </w:r>
     </w:p>
     <w:p>
@@ -1296,7 +1296,7 @@
           <w:sz w:val="24"/>
           <w:szCs w:val="24"/>
         </w:rPr>
-        <w:t xml:space="preserve">看过网安团队的真实漏洞案例后，写代码的时候心态变了。输入校验该做的做、权限控制该加的加、敏感数据该保护的保护。这些事情课本上也在讲，但看过真实攻击路径之后，重视程度完全不同。</w:t>
+        <w:t xml:space="preserve">这是我第一次接触网络安全。看过网安团队的真实漏洞案例后，写代码时的心态变了。输入校验该做的做、权限控制该加的加、敏感数据该保护的保护。以前脑子里没有安全这根弦，看了真实案例之后才意识到这些细节有多重要。</w:t>
       </w:r>
     </w:p>
     <w:p>
@@ -1348,21 +1348,21 @@
           <w:sz w:val="24"/>
           <w:szCs w:val="24"/>
         </w:rPr>
-        <w:t xml:space="preserve">回头看这两个多月的实习，算是完成了从课堂到工程实践的一次跨越。在广东创科安全科技有限公司，我在四个方向上都动了手：AI编程这边独立做了学生管理系统和个人主页两个项目，AIGC这边在键盘图和桌宠动图两个项目上做了探索（虽然都没能全部完成，但提示词工程方面的积累是实打实的），资产收集跟着跑了一趟实地，网络安全方面也认真研究了真实案例。整体下来，全栈开发能力和AI工程化探索能力这两条线，进步是明显的。</w:t>
-      </w:r>
-    </w:p>
-    <w:p>
-      <w:pPr>
-        <w:spacing w:after="120" w:line="360"/>
-        <w:ind w:firstLine="480"/>
-        <w:jc w:val="both"/>
-      </w:pPr>
-      <w:r>
-        <w:rPr>
-          <w:sz w:val="24"/>
-          <w:szCs w:val="24"/>
-        </w:rPr>
-        <w:t xml:space="preserve">接下来我的学习方向会比较聚焦——AI Agent、AIGC创作和AI自动化办公这几个领域想深入下去。实习期间积累的技术能力和工程经验，我想把它们一步步转化成实际能用的东西。chisa.official同学目前还是一名准大二学生，离真正合格的AI应用工程师还有一段路要走，但这次实习至少让我知道了自己的能力边界在哪里、该往哪个方向使劲。</w:t>
+        <w:t xml:space="preserve">回头再看这一个月的实习，算是完成了从课堂到工程实践的一次跨越。在广东创科安全科技有限公司，我在四个方向上都动了手：AI编程这边独立做了学生管理系统和个人主页两个项目，AIGC这边在键盘图和桌宠动图两个项目上做了探索（虽然都没能全部完成，但提示词工程方面的积累是实打实的），资产收集跟着跑了一趟实地，网络安全方面也第一次有了实际接触。整体下来，全栈开发能力和AI工程化探索能力这两条线，进步是明显的。</w:t>
+      </w:r>
+    </w:p>
+    <w:p>
+      <w:pPr>
+        <w:spacing w:after="120" w:line="360"/>
+        <w:ind w:firstLine="480"/>
+        <w:jc w:val="both"/>
+      </w:pPr>
+      <w:r>
+        <w:rPr>
+          <w:sz w:val="24"/>
+          <w:szCs w:val="24"/>
+        </w:rPr>
+        <w:t xml:space="preserve">接下来我的学习方向会比较聚焦——AI Agent、AIGC创作和AI自动化办公这几个领域想深入下去。实习期间积累的技术能力和工程经验，我想把它们一步步转化成实际能用的东西。我目前还是一名准大二学生，离真正合格的AI应用工程师还有一段路要走，但这次实习至少让我知道了自己的能力边界在哪里、该往哪个方向使劲。</w:t>
       </w:r>
     </w:p>
     <w:sectPr>

</xml_diff>